<commit_message>
Replace PCTO with FSL in all documents
</commit_message>
<xml_diff>
--- a/documenti/Regolamento-IA-Ferraris-Fermi.docx
+++ b/documenti/Regolamento-IA-Ferraris-Fermi.docx
@@ -654,7 +654,7 @@
         <w:rPr/>
         <w:t>2. Il Regolamento si applica ogni qualvolta l’uso dell’IA:</w:t>
         <w:br/>
-        <w:t xml:space="preserve">   a) sia correlato ad attività scolastiche curricolari o extracurricolari (lezioni, laboratori, corsi pomeridiani, progetti interdisciplinari, PCTO);</w:t>
+        <w:t xml:space="preserve">   a) sia correlato ad attività scolastiche curricolari o extracurricolari (lezioni, laboratori, corsi pomeridiani, progetti interdisciplinari, FSL);</w:t>
         <w:br/>
         <w:t xml:space="preserve">   b) avvenga tramite strumenti raccomandati, autorizzati o messi a disposizione dall’Istituto;</w:t>
         <w:br/>
@@ -880,7 +880,7 @@
       </w:pPr>
       <w:r>
         <w:rPr/>
-        <w:t>7. Ambito PCTO: L’impiego di strumenti di IA nei percorsi di alternanza scuola-lavoro deve conformarsi alle disposizioni dell'ente ospitante, con divieto assoluto di immettere dati aziendali riservati in piattaforme pubbliche.</w:t>
+        <w:t>7. Ambito FSL: L’impiego di strumenti di IA nei percorsi di alternanza scuola-lavoro deve conformarsi alle disposizioni dell'ente ospitante, con divieto assoluto di immettere dati aziendali riservati in piattaforme pubbliche.</w:t>
       </w:r>
     </w:p>
     <w:p>

</xml_diff>